<commit_message>
Initial commit: Menush Airbnb ETL & Dimensional Warehousing Pipeline
</commit_message>
<xml_diff>
--- a/data/gold/Menush_Expernetic_Report.docx
+++ b/data/gold/Menush_Expernetic_Report.docx
@@ -3397,7 +3397,15 @@
         <w:pStyle w:val="ListBullet"/>
       </w:pPr>
       <w:r>
-        <w:t>Additional Cities: Scale to 5+ cities to validate cross-market pattern generalization.</w:t>
+        <w:t>Additional Cities: Scale to 5+ cities (Barcelona, Paris, Rome, Lisbon, Berlin) to validate cross-market pattern generalization and create a pan-European short-term rental benchmark.</w:t>
+      </w:r>
+    </w:p>
+    <w:p>
+      <w:pPr>
+        <w:pStyle w:val="ListBullet"/>
+      </w:pPr>
+      <w:r>
+        <w:t>AI Chatbot for Natural Language Querying: Develop a conversational interface allowing non-technical users to ask questions like 'What is the average price of entire homes near Dam Square in June?' The chatbot would parse natural language, generate parameterized DuckDB SQL queries, and return results with auto-generated visualizations. This would democratize data access without requiring Power BI or SQL knowledge.</w:t>
       </w:r>
     </w:p>
     <w:p>
@@ -3449,7 +3457,7 @@
     </w:p>
     <w:p>
       <w:r>
-        <w:t>**Assignment:** Expernetic Talent Assessment Program — Data Engineer Intern</w:t>
+        <w:t>**Assignment:** Expernetic Talent Assessment Program â€” Data Engineer Intern</w:t>
       </w:r>
     </w:p>
     <w:p>
@@ -3553,22 +3561,22 @@
     </w:p>
     <w:p>
       <w:r>
-        <w:t>1. *"Create a complete, reproducible solution that processes the Inside Airbnb public dataset using an event-driven architecture triggered by Tines and executed via GitHub Actions."* — Initial project scaffolding prompt.</w:t>
+        <w:t>1. *"Create a complete, reproducible solution that processes the Inside Airbnb public dataset using an event-driven architecture triggered by Tines and executed via GitHub Actions."* â€” Initial project scaffolding prompt.</w:t>
       </w:r>
     </w:p>
     <w:p>
       <w:r>
-        <w:t>2. *"The pipeline crashed with a ConversionException on bathrooms_text. Fix the DuckDB SQL to handle empty strings and half-bath values."* — Debugging prompt leading to `nullif(regexp_extract(...), '')` fix.</w:t>
+        <w:t>2. *"The pipeline crashed with a ConversionException on bathrooms_text. Fix the DuckDB SQL to handle empty strings and half-bath values."* â€” Debugging prompt leading to `nullif(regexp_extract(...), '')` fix.</w:t>
       </w:r>
     </w:p>
     <w:p>
       <w:r>
-        <w:t>3. *"Add the missing hypothesis tests H1, H2, H3, H5 from the assignment specification with proper null/alternative statements, test selection rationale, and business interpretation."* — Statistical analysis expansion.</w:t>
+        <w:t>3. *"Add the missing hypothesis tests H1, H2, H3, H5 from the assignment specification with proper null/alternative statements, test selection rationale, and business interpretation."* â€” Statistical analysis expansion.</w:t>
       </w:r>
     </w:p>
     <w:p>
       <w:r>
-        <w:t>4. *"Create a comprehensive gap analysis mapping every assignment requirement against the current implementation."* — Gap analysis and prioritization.</w:t>
+        <w:t>4. *"Create a comprehensive gap analysis mapping every assignment requirement against the current implementation."* â€” Gap analysis and prioritization.</w:t>
       </w:r>
     </w:p>
     <w:p>

</xml_diff>